<commit_message>
updated solutions and meeting time
</commit_message>
<xml_diff>
--- a/Modeling Practice/Practice 1 - Linear Regression/Practice 1 Solutions.docx
+++ b/Modeling Practice/Practice 1 - Linear Regression/Practice 1 Solutions.docx
@@ -19,6 +19,9 @@
         <w:t>Practice Assignment 1</w:t>
       </w:r>
       <w:r>
+        <w:t xml:space="preserve"> Solutions</w:t>
+      </w:r>
+      <w:r>
         <w:br/>
       </w:r>
       <w:r>
@@ -114,15 +117,7 @@
         </w:numPr>
       </w:pPr>
       <w:r>
-        <w:t>Life expectancy (</w:t>
-      </w:r>
-      <w:proofErr w:type="spellStart"/>
-      <w:r>
-        <w:t>LifeExpectancy</w:t>
-      </w:r>
-      <w:proofErr w:type="spellEnd"/>
-      <w:r>
-        <w:t>),</w:t>
+        <w:t>Life expectancy (LifeExpectancy),</w:t>
       </w:r>
     </w:p>
     <w:p>
@@ -134,15 +129,7 @@
         </w:numPr>
       </w:pPr>
       <w:r>
-        <w:t>Average number of years of schooling (</w:t>
-      </w:r>
-      <w:proofErr w:type="spellStart"/>
-      <w:r>
-        <w:t>YearsSchool</w:t>
-      </w:r>
-      <w:proofErr w:type="spellEnd"/>
-      <w:r>
-        <w:t>),</w:t>
+        <w:t>Average number of years of schooling (YearsSchool),</w:t>
       </w:r>
     </w:p>
     <w:p>
@@ -196,15 +183,7 @@
         <w:t>n index score rating the quality of education in the given country</w:t>
       </w:r>
       <w:r>
-        <w:t xml:space="preserve"> (</w:t>
-      </w:r>
-      <w:proofErr w:type="spellStart"/>
-      <w:r>
-        <w:t>EduIndex</w:t>
-      </w:r>
-      <w:proofErr w:type="spellEnd"/>
-      <w:r>
-        <w:t>), and</w:t>
+        <w:t xml:space="preserve"> (EduIndex), and</w:t>
       </w:r>
     </w:p>
     <w:p>
@@ -243,15 +222,7 @@
         <w:t xml:space="preserve"> much the given country spends on public health programs</w:t>
       </w:r>
       <w:r>
-        <w:t xml:space="preserve"> (</w:t>
-      </w:r>
-      <w:proofErr w:type="spellStart"/>
-      <w:r>
-        <w:t>PubHealthExp</w:t>
-      </w:r>
-      <w:proofErr w:type="spellEnd"/>
-      <w:r>
-        <w:t xml:space="preserve">). </w:t>
+        <w:t xml:space="preserve"> (PubHealthExp). </w:t>
       </w:r>
     </w:p>
     <w:p/>
@@ -306,21 +277,7 @@
         <w:rPr>
           <w:bCs/>
         </w:rPr>
-        <w:t xml:space="preserve">This will also load the </w:t>
-      </w:r>
-      <w:proofErr w:type="spellStart"/>
-      <w:r>
-        <w:rPr>
-          <w:bCs/>
-        </w:rPr>
-        <w:t>tidyverse</w:t>
-      </w:r>
-      <w:proofErr w:type="spellEnd"/>
-      <w:r>
-        <w:rPr>
-          <w:bCs/>
-        </w:rPr>
-        <w:t>.</w:t>
+        <w:t>This will also load the tidyverse.</w:t>
       </w:r>
       <w:r>
         <w:rPr>
@@ -369,28 +326,14 @@
         <w:rPr>
           <w:bCs/>
         </w:rPr>
+        <w:t xml:space="preserve"> all of the variables</w:t>
+      </w:r>
+      <w:r>
+        <w:rPr>
+          <w:bCs/>
+        </w:rPr>
         <w:t xml:space="preserve"> </w:t>
       </w:r>
-      <w:proofErr w:type="gramStart"/>
-      <w:r>
-        <w:rPr>
-          <w:bCs/>
-        </w:rPr>
-        <w:t>all of</w:t>
-      </w:r>
-      <w:proofErr w:type="gramEnd"/>
-      <w:r>
-        <w:rPr>
-          <w:bCs/>
-        </w:rPr>
-        <w:t xml:space="preserve"> the variables</w:t>
-      </w:r>
-      <w:r>
-        <w:rPr>
-          <w:bCs/>
-        </w:rPr>
-        <w:t xml:space="preserve"> </w:t>
-      </w:r>
       <w:r>
         <w:rPr>
           <w:bCs/>
@@ -439,27 +382,11 @@
         </w:rPr>
         <w:t xml:space="preserve"> You can do this with the </w:t>
       </w:r>
-      <w:proofErr w:type="spellStart"/>
-      <w:proofErr w:type="gramStart"/>
-      <w:r>
-        <w:rPr>
-          <w:b/>
-        </w:rPr>
-        <w:t>cor</w:t>
-      </w:r>
-      <w:proofErr w:type="spellEnd"/>
-      <w:r>
-        <w:rPr>
-          <w:b/>
-        </w:rPr>
-        <w:t>(</w:t>
-      </w:r>
-      <w:proofErr w:type="gramEnd"/>
-      <w:r>
-        <w:rPr>
-          <w:b/>
-        </w:rPr>
-        <w:t>)</w:t>
+      <w:r>
+        <w:rPr>
+          <w:b/>
+        </w:rPr>
+        <w:t>cor()</w:t>
       </w:r>
       <w:r>
         <w:rPr>
@@ -901,21 +828,7 @@
         <w:rPr>
           <w:bCs/>
         </w:rPr>
-        <w:t xml:space="preserve">Using </w:t>
-      </w:r>
-      <w:proofErr w:type="spellStart"/>
-      <w:r>
-        <w:rPr>
-          <w:bCs/>
-        </w:rPr>
-        <w:t>ggplot</w:t>
-      </w:r>
-      <w:proofErr w:type="spellEnd"/>
-      <w:r>
-        <w:rPr>
-          <w:bCs/>
-        </w:rPr>
-        <w:t>, m</w:t>
+        <w:t>Using ggplot, m</w:t>
       </w:r>
       <w:r>
         <w:rPr>
@@ -951,21 +864,7 @@
         <w:rPr>
           <w:bCs/>
         </w:rPr>
-        <w:t xml:space="preserve"> (on the x-axis). In addition, include the line of best fit by adding this line of code to your </w:t>
-      </w:r>
-      <w:proofErr w:type="spellStart"/>
-      <w:r>
-        <w:rPr>
-          <w:bCs/>
-        </w:rPr>
-        <w:t>ggplot</w:t>
-      </w:r>
-      <w:proofErr w:type="spellEnd"/>
-      <w:r>
-        <w:rPr>
-          <w:bCs/>
-        </w:rPr>
-        <w:t>:</w:t>
+        <w:t xml:space="preserve"> (on the x-axis). In addition, include the line of best fit by adding this line of code to your ggplot:</w:t>
       </w:r>
       <w:r>
         <w:rPr>
@@ -973,47 +872,11 @@
         </w:rPr>
         <w:br/>
       </w:r>
-      <w:proofErr w:type="spellStart"/>
-      <w:r>
-        <w:rPr>
-          <w:b/>
-        </w:rPr>
-        <w:t>geom_</w:t>
-      </w:r>
-      <w:proofErr w:type="gramStart"/>
-      <w:r>
-        <w:rPr>
-          <w:b/>
-        </w:rPr>
-        <w:t>smooth</w:t>
-      </w:r>
-      <w:proofErr w:type="spellEnd"/>
-      <w:r>
-        <w:rPr>
-          <w:b/>
-        </w:rPr>
-        <w:t>(</w:t>
-      </w:r>
-      <w:proofErr w:type="gramEnd"/>
-      <w:r>
-        <w:rPr>
-          <w:b/>
-        </w:rPr>
-        <w:t>method = "</w:t>
-      </w:r>
-      <w:proofErr w:type="spellStart"/>
-      <w:r>
-        <w:rPr>
-          <w:b/>
-        </w:rPr>
-        <w:t>lm</w:t>
-      </w:r>
-      <w:proofErr w:type="spellEnd"/>
-      <w:r>
-        <w:rPr>
-          <w:b/>
-        </w:rPr>
-        <w:t>", formula = "y ~ x", se = F)</w:t>
+      <w:r>
+        <w:rPr>
+          <w:b/>
+        </w:rPr>
+        <w:t>geom_smooth(method = "lm", formula = "y ~ x", se = F)</w:t>
       </w:r>
       <w:r>
         <w:rPr>
@@ -1034,6 +897,7 @@
       <w:r>
         <w:rPr>
           <w:bCs/>
+          <w:noProof/>
         </w:rPr>
         <w:drawing>
           <wp:inline distT="0" distB="0" distL="0" distR="0" wp14:anchorId="231634A2" wp14:editId="5E79354B">
@@ -1153,13 +1017,7 @@
         <w:rPr>
           <w:b/>
         </w:rPr>
-        <w:t xml:space="preserve"> with three outliers</w:t>
-      </w:r>
-      <w:r>
-        <w:rPr>
-          <w:b/>
-        </w:rPr>
-        <w:t xml:space="preserve"> that have life expectancies below 52</w:t>
+        <w:t xml:space="preserve"> with three outliers that have life expectancies below 52</w:t>
       </w:r>
       <w:r>
         <w:rPr>
@@ -1279,9 +1137,9 @@
             <m:t>=83.96-32.86(GII)</m:t>
           </m:r>
           <m:r>
-            <w:rPr>
-              <w:bCs/>
-            </w:rPr>
+            <m:rPr>
+              <m:sty m:val="p"/>
+            </m:rPr>
             <w:br/>
           </m:r>
         </m:oMath>
@@ -1304,7 +1162,6 @@
         </w:rPr>
         <w:t xml:space="preserve">Use the </w:t>
       </w:r>
-      <w:proofErr w:type="gramStart"/>
       <w:r>
         <w:rPr>
           <w:b/>
@@ -1315,14 +1172,7 @@
         <w:rPr>
           <w:b/>
         </w:rPr>
-        <w:t>(</w:t>
-      </w:r>
-      <w:proofErr w:type="gramEnd"/>
-      <w:r>
-        <w:rPr>
-          <w:b/>
-        </w:rPr>
-        <w:t>)</w:t>
+        <w:t>()</w:t>
       </w:r>
       <w:r>
         <w:rPr>
@@ -1390,49 +1240,11 @@
         </w:rPr>
         <w:br/>
       </w:r>
-      <w:proofErr w:type="gramStart"/>
-      <w:r>
-        <w:rPr>
-          <w:b/>
-        </w:rPr>
-        <w:t>predict(</w:t>
-      </w:r>
-      <w:proofErr w:type="spellStart"/>
-      <w:proofErr w:type="gramEnd"/>
-      <w:r>
-        <w:rPr>
-          <w:b/>
-        </w:rPr>
-        <w:t>country_mod</w:t>
-      </w:r>
-      <w:proofErr w:type="spellEnd"/>
-      <w:r>
-        <w:rPr>
-          <w:b/>
-        </w:rPr>
-        <w:t xml:space="preserve">, </w:t>
-      </w:r>
-      <w:proofErr w:type="spellStart"/>
-      <w:proofErr w:type="gramStart"/>
-      <w:r>
-        <w:rPr>
-          <w:b/>
-        </w:rPr>
-        <w:t>data.frame</w:t>
-      </w:r>
-      <w:proofErr w:type="spellEnd"/>
-      <w:proofErr w:type="gramEnd"/>
-      <w:r>
-        <w:rPr>
-          <w:b/>
-        </w:rPr>
-        <w:t>(GII = 0.5))</w:t>
-      </w:r>
-      <w:r>
-        <w:rPr>
-          <w:b/>
-        </w:rPr>
-        <w:t xml:space="preserve"> gives a value of 67.53. That is the same as plugging 0.5 in for GII in the model equation in part c.</w:t>
+      <w:r>
+        <w:rPr>
+          <w:b/>
+        </w:rPr>
+        <w:t>predict(country_mod, data.frame(GII = 0.5)) gives a value of 67.53. That is the same as plugging 0.5 in for GII in the model equation in part c.</w:t>
       </w:r>
       <w:r>
         <w:rPr>
@@ -1464,19 +1276,11 @@
         </w:rPr>
         <w:t xml:space="preserve">Use the </w:t>
       </w:r>
-      <w:proofErr w:type="gramStart"/>
-      <w:r>
-        <w:rPr>
-          <w:b/>
-        </w:rPr>
-        <w:t>predict(</w:t>
-      </w:r>
-      <w:proofErr w:type="gramEnd"/>
-      <w:r>
-        <w:rPr>
-          <w:b/>
-        </w:rPr>
-        <w:t>)</w:t>
+      <w:r>
+        <w:rPr>
+          <w:b/>
+        </w:rPr>
+        <w:t>predict()</w:t>
       </w:r>
       <w:r>
         <w:rPr>
@@ -1508,43 +1312,11 @@
         </w:rPr>
         <w:br/>
       </w:r>
-      <w:proofErr w:type="gramStart"/>
-      <w:r>
-        <w:rPr>
-          <w:b/>
-        </w:rPr>
-        <w:t>predict(</w:t>
-      </w:r>
-      <w:proofErr w:type="spellStart"/>
-      <w:proofErr w:type="gramEnd"/>
-      <w:r>
-        <w:rPr>
-          <w:b/>
-        </w:rPr>
-        <w:t>country_mod</w:t>
-      </w:r>
-      <w:proofErr w:type="spellEnd"/>
-      <w:r>
-        <w:rPr>
-          <w:b/>
-        </w:rPr>
-        <w:t xml:space="preserve">, </w:t>
-      </w:r>
-      <w:proofErr w:type="spellStart"/>
-      <w:proofErr w:type="gramStart"/>
-      <w:r>
-        <w:rPr>
-          <w:b/>
-        </w:rPr>
-        <w:t>data.frame</w:t>
-      </w:r>
-      <w:proofErr w:type="spellEnd"/>
-      <w:proofErr w:type="gramEnd"/>
-      <w:r>
-        <w:rPr>
-          <w:b/>
-        </w:rPr>
-        <w:t xml:space="preserve">(GII = </w:t>
+      <w:r>
+        <w:rPr>
+          <w:b/>
+        </w:rPr>
+        <w:t xml:space="preserve">predict(country_mod, data.frame(GII = </w:t>
       </w:r>
       <w:r>
         <w:rPr>
@@ -1622,13 +1394,7 @@
         <w:rPr>
           <w:b/>
         </w:rPr>
-        <w:t>The slope is -32.86. This tells us that w</w:t>
-      </w:r>
-      <w:r>
-        <w:rPr>
-          <w:b/>
-        </w:rPr>
-        <w:t>hen the gender inequality index (GII) for a country</w:t>
+        <w:t>The slope is -32.86. This tells us that when the gender inequality index (GII) for a country</w:t>
       </w:r>
       <w:r>
         <w:rPr>
@@ -1752,19 +1518,11 @@
         </w:rPr>
         <w:t xml:space="preserve">According to the output of the model (when you use the </w:t>
       </w:r>
-      <w:proofErr w:type="gramStart"/>
-      <w:r>
-        <w:rPr>
-          <w:b/>
-        </w:rPr>
-        <w:t>summary(</w:t>
-      </w:r>
-      <w:proofErr w:type="gramEnd"/>
-      <w:r>
-        <w:rPr>
-          <w:b/>
-        </w:rPr>
-        <w:t>)</w:t>
+      <w:r>
+        <w:rPr>
+          <w:b/>
+        </w:rPr>
+        <w:t>summary()</w:t>
       </w:r>
       <w:r>
         <w:rPr>
@@ -1782,19 +1540,7 @@
         <w:rPr>
           <w:b/>
         </w:rPr>
-        <w:t xml:space="preserve">The p-value for the GII variable is </w:t>
-      </w:r>
-      <w:r>
-        <w:rPr>
-          <w:b/>
-        </w:rPr>
-        <w:t>3.44e-09</w:t>
-      </w:r>
-      <w:r>
-        <w:rPr>
-          <w:b/>
-        </w:rPr>
-        <w:t xml:space="preserve">, which is </w:t>
+        <w:t xml:space="preserve">The p-value for the GII variable is 3.44e-09, which is </w:t>
       </w:r>
       <m:oMath>
         <m:r>
@@ -1881,19 +1627,11 @@
         </w:rPr>
         <w:t xml:space="preserve">Use the </w:t>
       </w:r>
-      <w:proofErr w:type="gramStart"/>
-      <w:r>
-        <w:rPr>
-          <w:b/>
-        </w:rPr>
-        <w:t>predict(</w:t>
-      </w:r>
-      <w:proofErr w:type="gramEnd"/>
-      <w:r>
-        <w:rPr>
-          <w:b/>
-        </w:rPr>
-        <w:t>)</w:t>
+      <w:r>
+        <w:rPr>
+          <w:b/>
+        </w:rPr>
+        <w:t>predict()</w:t>
       </w:r>
       <w:r>
         <w:rPr>
@@ -1974,43 +1712,11 @@
         </w:rPr>
         <w:br/>
       </w:r>
-      <w:proofErr w:type="gramStart"/>
-      <w:r>
-        <w:rPr>
-          <w:b/>
-        </w:rPr>
-        <w:t>predict(</w:t>
-      </w:r>
-      <w:proofErr w:type="spellStart"/>
-      <w:proofErr w:type="gramEnd"/>
-      <w:r>
-        <w:rPr>
-          <w:b/>
-        </w:rPr>
-        <w:t>country_mod</w:t>
-      </w:r>
-      <w:proofErr w:type="spellEnd"/>
-      <w:r>
-        <w:rPr>
-          <w:b/>
-        </w:rPr>
-        <w:t xml:space="preserve">, </w:t>
-      </w:r>
-      <w:proofErr w:type="spellStart"/>
-      <w:proofErr w:type="gramStart"/>
-      <w:r>
-        <w:rPr>
-          <w:b/>
-        </w:rPr>
-        <w:t>data.frame</w:t>
-      </w:r>
-      <w:proofErr w:type="spellEnd"/>
-      <w:proofErr w:type="gramEnd"/>
-      <w:r>
-        <w:rPr>
-          <w:b/>
-        </w:rPr>
-        <w:t>(GII = 0.5), interval = "prediction")</w:t>
+      <w:r>
+        <w:rPr>
+          <w:b/>
+        </w:rPr>
+        <w:t>predict(country_mod, data.frame(GII = 0.5), interval = "prediction")</w:t>
       </w:r>
       <w:r>
         <w:rPr>
@@ -2328,9 +2034,9 @@
             <m:t>-1.16(PubHealthExp)</m:t>
           </m:r>
           <m:r>
-            <w:rPr>
-              <w:bCs/>
-            </w:rPr>
+            <m:rPr>
+              <m:sty m:val="p"/>
+            </m:rPr>
             <w:br/>
           </m:r>
         </m:oMath>
@@ -2359,19 +2065,11 @@
         </w:rPr>
         <w:t xml:space="preserve"> (or </w:t>
       </w:r>
-      <w:proofErr w:type="gramStart"/>
-      <w:r>
-        <w:rPr>
-          <w:b/>
-        </w:rPr>
-        <w:t>predict(</w:t>
-      </w:r>
-      <w:proofErr w:type="gramEnd"/>
-      <w:r>
-        <w:rPr>
-          <w:b/>
-        </w:rPr>
-        <w:t>)</w:t>
+      <w:r>
+        <w:rPr>
+          <w:b/>
+        </w:rPr>
+        <w:t>predict()</w:t>
       </w:r>
       <w:r>
         <w:rPr>
@@ -2395,81 +2093,7 @@
         <w:rPr>
           <w:b/>
         </w:rPr>
-        <w:t>predict(</w:t>
-      </w:r>
-      <w:proofErr w:type="spellStart"/>
-      <w:r>
-        <w:rPr>
-          <w:b/>
-        </w:rPr>
-        <w:t>county_mod_mult</w:t>
-      </w:r>
-      <w:proofErr w:type="spellEnd"/>
-      <w:r>
-        <w:rPr>
-          <w:b/>
-        </w:rPr>
-        <w:t xml:space="preserve">, </w:t>
-      </w:r>
-      <w:proofErr w:type="spellStart"/>
-      <w:r>
-        <w:rPr>
-          <w:b/>
-        </w:rPr>
-        <w:t>data.frame</w:t>
-      </w:r>
-      <w:proofErr w:type="spellEnd"/>
-      <w:r>
-        <w:rPr>
-          <w:b/>
-        </w:rPr>
-        <w:t xml:space="preserve">(GDP = 20000, GII = 0.4, </w:t>
-      </w:r>
-      <w:proofErr w:type="spellStart"/>
-      <w:r>
-        <w:rPr>
-          <w:b/>
-        </w:rPr>
-        <w:t>EduIndex</w:t>
-      </w:r>
-      <w:proofErr w:type="spellEnd"/>
-      <w:r>
-        <w:rPr>
-          <w:b/>
-        </w:rPr>
-        <w:t xml:space="preserve"> = 0.3, </w:t>
-      </w:r>
-      <w:proofErr w:type="spellStart"/>
-      <w:r>
-        <w:rPr>
-          <w:b/>
-        </w:rPr>
-        <w:t>PubHealthExp</w:t>
-      </w:r>
-      <w:proofErr w:type="spellEnd"/>
-      <w:r>
-        <w:rPr>
-          <w:b/>
-        </w:rPr>
-        <w:t xml:space="preserve"> = 1.8))</w:t>
-      </w:r>
-      <w:r>
-        <w:rPr>
-          <w:b/>
-        </w:rPr>
-        <w:t xml:space="preserve"> gives a value of </w:t>
-      </w:r>
-      <w:r>
-        <w:rPr>
-          <w:b/>
-        </w:rPr>
-        <w:t>72.98</w:t>
-      </w:r>
-      <w:r>
-        <w:rPr>
-          <w:b/>
-        </w:rPr>
-        <w:t>.</w:t>
+        <w:t>predict(county_mod_mult, data.frame(GDP = 20000, GII = 0.4, EduIndex = 0.3, PubHealthExp = 1.8)) gives a value of 72.98.</w:t>
       </w:r>
       <w:r>
         <w:rPr>
@@ -2878,33 +2502,11 @@
         </w:rPr>
         <w:t xml:space="preserve">Use the </w:t>
       </w:r>
-      <w:proofErr w:type="spellStart"/>
-      <w:r>
-        <w:rPr>
-          <w:b/>
-        </w:rPr>
-        <w:t>residual_</w:t>
-      </w:r>
-      <w:proofErr w:type="gramStart"/>
-      <w:r>
-        <w:rPr>
-          <w:b/>
-        </w:rPr>
-        <w:t>plots</w:t>
-      </w:r>
-      <w:proofErr w:type="spellEnd"/>
-      <w:r>
-        <w:rPr>
-          <w:b/>
-        </w:rPr>
-        <w:t>(</w:t>
-      </w:r>
-      <w:proofErr w:type="gramEnd"/>
-      <w:r>
-        <w:rPr>
-          <w:b/>
-        </w:rPr>
-        <w:t>)</w:t>
+      <w:r>
+        <w:rPr>
+          <w:b/>
+        </w:rPr>
+        <w:t>residual_plots()</w:t>
       </w:r>
       <w:r>
         <w:rPr>
@@ -2924,14 +2526,12 @@
         </w:rPr>
         <w:t xml:space="preserve"> with </w:t>
       </w:r>
-      <w:proofErr w:type="spellStart"/>
       <w:r>
         <w:rPr>
           <w:b/>
         </w:rPr>
         <w:t>resid_type</w:t>
       </w:r>
-      <w:proofErr w:type="spellEnd"/>
       <w:r>
         <w:rPr>
           <w:b/>
@@ -2962,6 +2562,7 @@
       <w:r>
         <w:rPr>
           <w:bCs/>
+          <w:noProof/>
         </w:rPr>
         <w:drawing>
           <wp:inline distT="0" distB="0" distL="0" distR="0" wp14:anchorId="62CE79AB" wp14:editId="42DE9A79">
@@ -3008,6 +2609,7 @@
       <w:r>
         <w:rPr>
           <w:bCs/>
+          <w:noProof/>
         </w:rPr>
         <w:drawing>
           <wp:inline distT="0" distB="0" distL="0" distR="0" wp14:anchorId="27CE36B1" wp14:editId="4BBD57D1">
@@ -3169,33 +2771,11 @@
         </w:rPr>
         <w:t xml:space="preserve">Use the </w:t>
       </w:r>
-      <w:proofErr w:type="spellStart"/>
-      <w:r>
-        <w:rPr>
-          <w:b/>
-        </w:rPr>
-        <w:t>influence_</w:t>
-      </w:r>
-      <w:proofErr w:type="gramStart"/>
-      <w:r>
-        <w:rPr>
-          <w:b/>
-        </w:rPr>
-        <w:t>plots</w:t>
-      </w:r>
-      <w:proofErr w:type="spellEnd"/>
-      <w:r>
-        <w:rPr>
-          <w:b/>
-        </w:rPr>
-        <w:t>(</w:t>
-      </w:r>
-      <w:proofErr w:type="gramEnd"/>
-      <w:r>
-        <w:rPr>
-          <w:b/>
-        </w:rPr>
-        <w:t>)</w:t>
+      <w:r>
+        <w:rPr>
+          <w:b/>
+        </w:rPr>
+        <w:t>influence_plots()</w:t>
       </w:r>
       <w:r>
         <w:rPr>
@@ -3213,35 +2793,7 @@
         <w:rPr>
           <w:bCs/>
         </w:rPr>
-        <w:t xml:space="preserve">to create influence plots. Looking at Cook’s distance, </w:t>
-      </w:r>
-      <w:proofErr w:type="spellStart"/>
-      <w:r>
-        <w:rPr>
-          <w:bCs/>
-        </w:rPr>
-        <w:t>DfFits</w:t>
-      </w:r>
-      <w:proofErr w:type="spellEnd"/>
-      <w:r>
-        <w:rPr>
-          <w:bCs/>
-        </w:rPr>
-        <w:t xml:space="preserve">, and the </w:t>
-      </w:r>
-      <w:proofErr w:type="spellStart"/>
-      <w:r>
-        <w:rPr>
-          <w:bCs/>
-        </w:rPr>
-        <w:t>DfBetas</w:t>
-      </w:r>
-      <w:proofErr w:type="spellEnd"/>
-      <w:r>
-        <w:rPr>
-          <w:bCs/>
-        </w:rPr>
-        <w:t xml:space="preserve"> plots, which points seem to be more influential? What countries are those points? </w:t>
+        <w:t xml:space="preserve">to create influence plots. Looking at Cook’s distance, DfFits, and the DfBetas plots, which points seem to be more influential? What countries are those points? </w:t>
       </w:r>
     </w:p>
     <w:p>
@@ -3255,6 +2807,7 @@
       <w:r>
         <w:rPr>
           <w:bCs/>
+          <w:noProof/>
         </w:rPr>
         <w:drawing>
           <wp:inline distT="0" distB="0" distL="0" distR="0" wp14:anchorId="7066D61A" wp14:editId="164E999F">
@@ -3301,6 +2854,7 @@
       <w:r>
         <w:rPr>
           <w:bCs/>
+          <w:noProof/>
         </w:rPr>
         <w:drawing>
           <wp:inline distT="0" distB="0" distL="0" distR="0" wp14:anchorId="3E8472DA" wp14:editId="5BF38429">
@@ -3357,6 +2911,7 @@
       <w:r>
         <w:rPr>
           <w:bCs/>
+          <w:noProof/>
         </w:rPr>
         <w:drawing>
           <wp:inline distT="0" distB="0" distL="0" distR="0" wp14:anchorId="6D1F5965" wp14:editId="4E06DF14">

</xml_diff>